<commit_message>
feat(db): schéma initial V1 et mise à jour du modèle de données
- V1__init.sql : tables, types enum, contraintes d'exclusion (praticien et patient)
- Cohérence par clés étrangères composées (rôle, motif/praticien)
- CHECK sur l'annulation et la période de validité
- docs : modèle de données aligné sur la migration
- .gitignore : fichiers verrou LibreOffice
</commit_message>
<xml_diff>
--- a/docs/modele_donnees_reservation.docx
+++ b/docs/modele_donnees_reservation.docx
@@ -2418,7 +2418,7 @@
                 <w:sz w:val="19"/>
                 <w:szCs w:val="19"/>
               </w:rPr>
-              <w:t xml:space="preserve">NOT NULL</w:t>
+              <w:t xml:space="preserve">NOT NULL, UNIQUE (id, role)</w:t>
             </w:r>
           </w:p>
         </w:tc>
@@ -2445,7 +2445,7 @@
                 <w:sz w:val="19"/>
                 <w:szCs w:val="19"/>
               </w:rPr>
-              <w:t xml:space="preserve">Détermine les droits dans l'API</w:t>
+              <w:t xml:space="preserve">Détermine les droits dans l'API ; le couple (id, role) est la cible des FK de patient et praticien</w:t>
             </w:r>
           </w:p>
         </w:tc>
@@ -3948,7 +3948,7 @@
                 <w:sz w:val="19"/>
                 <w:szCs w:val="19"/>
               </w:rPr>
-              <w:t xml:space="preserve">PK, FK → utilisateur</w:t>
+              <w:t xml:space="preserve">PK, FK (utilisateur_id, role) → utilisateur</w:t>
             </w:r>
           </w:p>
         </w:tc>
@@ -3975,6 +3975,115 @@
                 <w:szCs w:val="19"/>
               </w:rPr>
               <w:t xml:space="preserve">Lien d'héritage</w:t>
+            </w:r>
+          </w:p>
+        </w:tc>
+      </w:tr>
+      <w:tr>
+        <w:trPr>
+          <w:cantSplit/>
+        </w:trPr>
+        <w:tc>
+          <w:tcPr>
+            <w:tcW w:type="dxa" w:w="2150"/>
+            <w:tcBorders>
+              <w:top w:val="single" w:color="C9D3DD" w:sz="4"/>
+              <w:left w:val="single" w:color="C9D3DD" w:sz="4"/>
+              <w:bottom w:val="single" w:color="C9D3DD" w:sz="4"/>
+              <w:right w:val="single" w:color="C9D3DD" w:sz="4"/>
+            </w:tcBorders>
+            <w:tcMar>
+              <w:top w:type="dxa" w:w="60"/>
+              <w:left w:type="dxa" w:w="100"/>
+              <w:bottom w:type="dxa" w:w="60"/>
+              <w:right w:type="dxa" w:w="100"/>
+            </w:tcMar>
+          </w:tcPr>
+          <w:p>
+            <w:r>
+              <w:rPr>
+                <w:sz w:val="19"/>
+                <w:szCs w:val="19"/>
+              </w:rPr>
+              <w:t xml:space="preserve">role</w:t>
+            </w:r>
+          </w:p>
+        </w:tc>
+        <w:tc>
+          <w:tcPr>
+            <w:tcW w:type="dxa" w:w="1750"/>
+            <w:tcBorders>
+              <w:top w:val="single" w:color="C9D3DD" w:sz="4"/>
+              <w:left w:val="single" w:color="C9D3DD" w:sz="4"/>
+              <w:bottom w:val="single" w:color="C9D3DD" w:sz="4"/>
+              <w:right w:val="single" w:color="C9D3DD" w:sz="4"/>
+            </w:tcBorders>
+            <w:tcMar>
+              <w:top w:type="dxa" w:w="60"/>
+              <w:left w:type="dxa" w:w="100"/>
+              <w:bottom w:type="dxa" w:w="60"/>
+              <w:right w:type="dxa" w:w="100"/>
+            </w:tcMar>
+          </w:tcPr>
+          <w:p>
+            <w:r>
+              <w:rPr>
+                <w:sz w:val="19"/>
+                <w:szCs w:val="19"/>
+              </w:rPr>
+              <w:t xml:space="preserve">role_utilisateur</w:t>
+            </w:r>
+          </w:p>
+        </w:tc>
+        <w:tc>
+          <w:tcPr>
+            <w:tcW w:type="dxa" w:w="2450"/>
+            <w:tcBorders>
+              <w:top w:val="single" w:color="C9D3DD" w:sz="4"/>
+              <w:left w:val="single" w:color="C9D3DD" w:sz="4"/>
+              <w:bottom w:val="single" w:color="C9D3DD" w:sz="4"/>
+              <w:right w:val="single" w:color="C9D3DD" w:sz="4"/>
+            </w:tcBorders>
+            <w:tcMar>
+              <w:top w:type="dxa" w:w="60"/>
+              <w:left w:type="dxa" w:w="100"/>
+              <w:bottom w:type="dxa" w:w="60"/>
+              <w:right w:type="dxa" w:w="100"/>
+            </w:tcMar>
+          </w:tcPr>
+          <w:p>
+            <w:r>
+              <w:rPr>
+                <w:sz w:val="19"/>
+                <w:szCs w:val="19"/>
+              </w:rPr>
+              <w:t xml:space="preserve">NOT NULL, DEFAULT 'PATIENT', CHECK = 'PATIENT'</w:t>
+            </w:r>
+          </w:p>
+        </w:tc>
+        <w:tc>
+          <w:tcPr>
+            <w:tcW w:type="dxa" w:w="3288"/>
+            <w:tcBorders>
+              <w:top w:val="single" w:color="C9D3DD" w:sz="4"/>
+              <w:left w:val="single" w:color="C9D3DD" w:sz="4"/>
+              <w:bottom w:val="single" w:color="C9D3DD" w:sz="4"/>
+              <w:right w:val="single" w:color="C9D3DD" w:sz="4"/>
+            </w:tcBorders>
+            <w:tcMar>
+              <w:top w:type="dxa" w:w="60"/>
+              <w:left w:type="dxa" w:w="100"/>
+              <w:bottom w:type="dxa" w:w="60"/>
+              <w:right w:type="dxa" w:w="100"/>
+            </w:tcMar>
+          </w:tcPr>
+          <w:p>
+            <w:r>
+              <w:rPr>
+                <w:sz w:val="19"/>
+                <w:szCs w:val="19"/>
+              </w:rPr>
+              <w:t xml:space="preserve">Garantit que l'utilisateur a le rôle PATIENT ; non mappée en JPA</w:t>
             </w:r>
           </w:p>
         </w:tc>
@@ -4339,7 +4448,7 @@
                 <w:sz w:val="19"/>
                 <w:szCs w:val="19"/>
               </w:rPr>
-              <w:t xml:space="preserve">PK, FK → utilisateur</w:t>
+              <w:t xml:space="preserve">PK, FK (utilisateur_id, role) → utilisateur</w:t>
             </w:r>
           </w:p>
         </w:tc>
@@ -4366,6 +4475,115 @@
                 <w:szCs w:val="19"/>
               </w:rPr>
               <w:t xml:space="preserve">Lien d'héritage</w:t>
+            </w:r>
+          </w:p>
+        </w:tc>
+      </w:tr>
+      <w:tr>
+        <w:trPr>
+          <w:cantSplit/>
+        </w:trPr>
+        <w:tc>
+          <w:tcPr>
+            <w:tcW w:type="dxa" w:w="2150"/>
+            <w:tcBorders>
+              <w:top w:val="single" w:color="C9D3DD" w:sz="4"/>
+              <w:left w:val="single" w:color="C9D3DD" w:sz="4"/>
+              <w:bottom w:val="single" w:color="C9D3DD" w:sz="4"/>
+              <w:right w:val="single" w:color="C9D3DD" w:sz="4"/>
+            </w:tcBorders>
+            <w:tcMar>
+              <w:top w:type="dxa" w:w="60"/>
+              <w:left w:type="dxa" w:w="100"/>
+              <w:bottom w:type="dxa" w:w="60"/>
+              <w:right w:type="dxa" w:w="100"/>
+            </w:tcMar>
+          </w:tcPr>
+          <w:p>
+            <w:r>
+              <w:rPr>
+                <w:sz w:val="19"/>
+                <w:szCs w:val="19"/>
+              </w:rPr>
+              <w:t xml:space="preserve">role</w:t>
+            </w:r>
+          </w:p>
+        </w:tc>
+        <w:tc>
+          <w:tcPr>
+            <w:tcW w:type="dxa" w:w="1750"/>
+            <w:tcBorders>
+              <w:top w:val="single" w:color="C9D3DD" w:sz="4"/>
+              <w:left w:val="single" w:color="C9D3DD" w:sz="4"/>
+              <w:bottom w:val="single" w:color="C9D3DD" w:sz="4"/>
+              <w:right w:val="single" w:color="C9D3DD" w:sz="4"/>
+            </w:tcBorders>
+            <w:tcMar>
+              <w:top w:type="dxa" w:w="60"/>
+              <w:left w:type="dxa" w:w="100"/>
+              <w:bottom w:type="dxa" w:w="60"/>
+              <w:right w:type="dxa" w:w="100"/>
+            </w:tcMar>
+          </w:tcPr>
+          <w:p>
+            <w:r>
+              <w:rPr>
+                <w:sz w:val="19"/>
+                <w:szCs w:val="19"/>
+              </w:rPr>
+              <w:t xml:space="preserve">role_utilisateur</w:t>
+            </w:r>
+          </w:p>
+        </w:tc>
+        <w:tc>
+          <w:tcPr>
+            <w:tcW w:type="dxa" w:w="2450"/>
+            <w:tcBorders>
+              <w:top w:val="single" w:color="C9D3DD" w:sz="4"/>
+              <w:left w:val="single" w:color="C9D3DD" w:sz="4"/>
+              <w:bottom w:val="single" w:color="C9D3DD" w:sz="4"/>
+              <w:right w:val="single" w:color="C9D3DD" w:sz="4"/>
+            </w:tcBorders>
+            <w:tcMar>
+              <w:top w:type="dxa" w:w="60"/>
+              <w:left w:type="dxa" w:w="100"/>
+              <w:bottom w:type="dxa" w:w="60"/>
+              <w:right w:type="dxa" w:w="100"/>
+            </w:tcMar>
+          </w:tcPr>
+          <w:p>
+            <w:r>
+              <w:rPr>
+                <w:sz w:val="19"/>
+                <w:szCs w:val="19"/>
+              </w:rPr>
+              <w:t xml:space="preserve">NOT NULL, DEFAULT 'PRATICIEN', CHECK = 'PRATICIEN'</w:t>
+            </w:r>
+          </w:p>
+        </w:tc>
+        <w:tc>
+          <w:tcPr>
+            <w:tcW w:type="dxa" w:w="3288"/>
+            <w:tcBorders>
+              <w:top w:val="single" w:color="C9D3DD" w:sz="4"/>
+              <w:left w:val="single" w:color="C9D3DD" w:sz="4"/>
+              <w:bottom w:val="single" w:color="C9D3DD" w:sz="4"/>
+              <w:right w:val="single" w:color="C9D3DD" w:sz="4"/>
+            </w:tcBorders>
+            <w:tcMar>
+              <w:top w:type="dxa" w:w="60"/>
+              <w:left w:type="dxa" w:w="100"/>
+              <w:bottom w:type="dxa" w:w="60"/>
+              <w:right w:type="dxa" w:w="100"/>
+            </w:tcMar>
+          </w:tcPr>
+          <w:p>
+            <w:r>
+              <w:rPr>
+                <w:sz w:val="19"/>
+                <w:szCs w:val="19"/>
+              </w:rPr>
+              <w:t xml:space="preserve">Garantit que l'utilisateur a le rôle PRATICIEN ; non mappée en JPA</w:t>
             </w:r>
           </w:p>
         </w:tc>
@@ -6415,7 +6633,7 @@
                 <w:sz w:val="19"/>
                 <w:szCs w:val="19"/>
               </w:rPr>
-              <w:t xml:space="preserve">FK → praticien, NOT NULL</w:t>
+              <w:t xml:space="preserve">FK → praticien, NOT NULL, UNIQUE (id, praticien_id)</w:t>
             </w:r>
           </w:p>
         </w:tc>
@@ -6442,7 +6660,7 @@
                 <w:sz w:val="19"/>
                 <w:szCs w:val="19"/>
               </w:rPr>
-              <w:t xml:space="preserve">Chaque praticien définit ses motifs</w:t>
+              <w:t xml:space="preserve">Chaque praticien définit ses motifs ; (id, praticien_id) est la cible de la FK de rendez_vous</w:t>
             </w:r>
           </w:p>
         </w:tc>
@@ -8012,7 +8230,15 @@
               <w:right w:type="dxa" w:w="100"/>
             </w:tcMar>
           </w:tcPr>
-          <w:p/>
+          <w:p>
+            <w:r>
+              <w:rPr>
+                <w:sz w:val="19"/>
+                <w:szCs w:val="19"/>
+              </w:rPr>
+              <w:t xml:space="preserve">CHECK ≥ valide_du</w:t>
+            </w:r>
+          </w:p>
         </w:tc>
         <w:tc>
           <w:tcPr>
@@ -9280,7 +9506,7 @@
                 <w:sz w:val="19"/>
                 <w:szCs w:val="19"/>
               </w:rPr>
-              <w:t xml:space="preserve">FK → motif, NOT NULL</w:t>
+              <w:t xml:space="preserve">FK (motif_id, praticien_id) → motif, NOT NULL</w:t>
             </w:r>
           </w:p>
         </w:tc>
@@ -9307,7 +9533,7 @@
                 <w:sz w:val="19"/>
                 <w:szCs w:val="19"/>
               </w:rPr>
-              <w:t xml:space="preserve">Détermine la durée</w:t>
+              <w:t xml:space="preserve">Détermine la durée ; doit appartenir au praticien du rendez-vous</w:t>
             </w:r>
           </w:p>
         </w:tc>
@@ -10138,7 +10364,15 @@
               <w:right w:type="dxa" w:w="100"/>
             </w:tcMar>
           </w:tcPr>
-          <w:p/>
+          <w:p>
+            <w:r>
+              <w:rPr>
+                <w:sz w:val="19"/>
+                <w:szCs w:val="19"/>
+              </w:rPr>
+              <w:t xml:space="preserve">CHECK : renseigné si et seulement si statut = ANNULE_*</w:t>
+            </w:r>
+          </w:p>
         </w:tc>
         <w:tc>
           <w:tcPr>
@@ -10298,14 +10532,30 @@
           <w:sz w:val="20"/>
           <w:szCs w:val="20"/>
         </w:rPr>
-        <w:t xml:space="preserve">EXCLUDE USING gist (praticien_id WITH =, tstzrange(debut, fin) WITH &amp;&amp;) WHERE (statut = 'CONFIRME')</w:t>
+        <w:t xml:space="preserve">EXCLUDE USING gist (praticien_id WITH =, tstzrange(debut, fin, '[)') WITH &amp;&amp;) WHERE (statut = 'CONFIRME')</w:t>
       </w:r>
       <w:r>
         <w:rPr>
           <w:sz w:val="22"/>
           <w:szCs w:val="22"/>
         </w:rPr>
-        <w:t xml:space="preserve">.</w:t>
+        <w:t xml:space="preserve">. L'intervalle [début, fin) exclut la fin : deux créneaux consécutifs (10:00–10:30 et 10:30–11:00) ne sont pas en conflit. Une violation lève le SQLSTATE </w:t>
+      </w:r>
+      <w:r>
+        <w:rPr>
+          <w:rFonts w:ascii="Consolas" w:cs="Consolas" w:eastAsia="Consolas" w:hAnsi="Consolas"/>
+          <w:color w:val="2B4A6B"/>
+          <w:sz w:val="20"/>
+          <w:szCs w:val="20"/>
+        </w:rPr>
+        <w:t xml:space="preserve">23P01</w:t>
+      </w:r>
+      <w:r>
+        <w:rPr>
+          <w:sz w:val="22"/>
+          <w:szCs w:val="22"/>
+        </w:rPr>
+        <w:t xml:space="preserve">, que l'API traduit en HTTP 409.</w:t>
       </w:r>
     </w:p>
     <w:p>
@@ -10355,7 +10605,7 @@
           <w:sz w:val="22"/>
           <w:szCs w:val="22"/>
         </w:rPr>
-        <w:t xml:space="preserve">Rôle cohérent avec la spécialisation : une ligne </w:t>
+        <w:t xml:space="preserve">Rôle cohérent avec la spécialisation : </w:t>
       </w:r>
       <w:r>
         <w:rPr>
@@ -10371,7 +10621,71 @@
           <w:sz w:val="22"/>
           <w:szCs w:val="22"/>
         </w:rPr>
-        <w:t xml:space="preserve"> ne doit exister que pour un utilisateur de rôle PATIENT (vérifié par l'API, ou par un trigger).</w:t>
+        <w:t xml:space="preserve"> et </w:t>
+      </w:r>
+      <w:r>
+        <w:rPr>
+          <w:rFonts w:ascii="Consolas" w:cs="Consolas" w:eastAsia="Consolas" w:hAnsi="Consolas"/>
+          <w:color w:val="2B4A6B"/>
+          <w:sz w:val="20"/>
+          <w:szCs w:val="20"/>
+        </w:rPr>
+        <w:t xml:space="preserve">praticien</w:t>
+      </w:r>
+      <w:r>
+        <w:rPr>
+          <w:sz w:val="22"/>
+          <w:szCs w:val="22"/>
+        </w:rPr>
+        <w:t xml:space="preserve"> portent une colonne </w:t>
+      </w:r>
+      <w:r>
+        <w:rPr>
+          <w:rFonts w:ascii="Consolas" w:cs="Consolas" w:eastAsia="Consolas" w:hAnsi="Consolas"/>
+          <w:color w:val="2B4A6B"/>
+          <w:sz w:val="20"/>
+          <w:szCs w:val="20"/>
+        </w:rPr>
+        <w:t xml:space="preserve">role</w:t>
+      </w:r>
+      <w:r>
+        <w:rPr>
+          <w:sz w:val="22"/>
+          <w:szCs w:val="22"/>
+        </w:rPr>
+        <w:t xml:space="preserve"> figée par </w:t>
+      </w:r>
+      <w:r>
+        <w:rPr>
+          <w:rFonts w:ascii="Consolas" w:cs="Consolas" w:eastAsia="Consolas" w:hAnsi="Consolas"/>
+          <w:color w:val="2B4A6B"/>
+          <w:sz w:val="20"/>
+          <w:szCs w:val="20"/>
+        </w:rPr>
+        <w:t xml:space="preserve">CHECK (role = 'PATIENT')</w:t>
+      </w:r>
+      <w:r>
+        <w:rPr>
+          <w:sz w:val="22"/>
+          <w:szCs w:val="22"/>
+        </w:rPr>
+        <w:t xml:space="preserve"> (ou 'PRATICIEN') et une clé étrangère composée </w:t>
+      </w:r>
+      <w:r>
+        <w:rPr>
+          <w:rFonts w:ascii="Consolas" w:cs="Consolas" w:eastAsia="Consolas" w:hAnsi="Consolas"/>
+          <w:color w:val="2B4A6B"/>
+          <w:sz w:val="20"/>
+          <w:szCs w:val="20"/>
+        </w:rPr>
+        <w:t xml:space="preserve">(utilisateur_id, role) → utilisateur (id, role)</w:t>
+      </w:r>
+      <w:r>
+        <w:rPr>
+          <w:sz w:val="22"/>
+          <w:szCs w:val="22"/>
+        </w:rPr>
+        <w:t xml:space="preserve">. Un praticien ne peut donc pas avoir de ligne patient, un utilisateur ne peut pas être les deux, et son rôle ne peut plus changer une fois spécialisé.</w:t>
       </w:r>
     </w:p>
     <w:p>
@@ -10388,7 +10702,186 @@
           <w:sz w:val="22"/>
           <w:szCs w:val="22"/>
         </w:rPr>
-        <w:t xml:space="preserve">Index utiles : </w:t>
+        <w:t xml:space="preserve">Motif cohérent avec le praticien : </w:t>
+      </w:r>
+      <w:r>
+        <w:rPr>
+          <w:rFonts w:ascii="Consolas" w:cs="Consolas" w:eastAsia="Consolas" w:hAnsi="Consolas"/>
+          <w:color w:val="2B4A6B"/>
+          <w:sz w:val="20"/>
+          <w:szCs w:val="20"/>
+        </w:rPr>
+        <w:t xml:space="preserve">FOREIGN KEY (motif_id, praticien_id) REFERENCES motif (id, praticien_id)</w:t>
+      </w:r>
+      <w:r>
+        <w:rPr>
+          <w:sz w:val="22"/>
+          <w:szCs w:val="22"/>
+        </w:rPr>
+        <w:t xml:space="preserve"> sur </w:t>
+      </w:r>
+      <w:r>
+        <w:rPr>
+          <w:rFonts w:ascii="Consolas" w:cs="Consolas" w:eastAsia="Consolas" w:hAnsi="Consolas"/>
+          <w:color w:val="2B4A6B"/>
+          <w:sz w:val="20"/>
+          <w:szCs w:val="20"/>
+        </w:rPr>
+        <w:t xml:space="preserve">rendez_vous</w:t>
+      </w:r>
+      <w:r>
+        <w:rPr>
+          <w:sz w:val="22"/>
+          <w:szCs w:val="22"/>
+        </w:rPr>
+        <w:t xml:space="preserve">, qui s'appuie sur </w:t>
+      </w:r>
+      <w:r>
+        <w:rPr>
+          <w:rFonts w:ascii="Consolas" w:cs="Consolas" w:eastAsia="Consolas" w:hAnsi="Consolas"/>
+          <w:color w:val="2B4A6B"/>
+          <w:sz w:val="20"/>
+          <w:szCs w:val="20"/>
+        </w:rPr>
+        <w:t xml:space="preserve">UNIQUE (id, praticien_id)</w:t>
+      </w:r>
+      <w:r>
+        <w:rPr>
+          <w:sz w:val="22"/>
+          <w:szCs w:val="22"/>
+        </w:rPr>
+        <w:t xml:space="preserve"> dans </w:t>
+      </w:r>
+      <w:r>
+        <w:rPr>
+          <w:rFonts w:ascii="Consolas" w:cs="Consolas" w:eastAsia="Consolas" w:hAnsi="Consolas"/>
+          <w:color w:val="2B4A6B"/>
+          <w:sz w:val="20"/>
+          <w:szCs w:val="20"/>
+        </w:rPr>
+        <w:t xml:space="preserve">motif</w:t>
+      </w:r>
+      <w:r>
+        <w:rPr>
+          <w:sz w:val="22"/>
+          <w:szCs w:val="22"/>
+        </w:rPr>
+        <w:t xml:space="preserve">.</w:t>
+      </w:r>
+    </w:p>
+    <w:p>
+      <w:pPr>
+        <w:pStyle w:val="ListParagraph"/>
+        <w:numPr>
+          <w:ilvl w:val="0"/>
+          <w:numId w:val="2"/>
+        </w:numPr>
+        <w:spacing w:after="80"/>
+      </w:pPr>
+      <w:r>
+        <w:rPr>
+          <w:sz w:val="22"/>
+          <w:szCs w:val="22"/>
+        </w:rPr>
+        <w:t xml:space="preserve">Annulation cohérente : </w:t>
+      </w:r>
+      <w:r>
+        <w:rPr>
+          <w:rFonts w:ascii="Consolas" w:cs="Consolas" w:eastAsia="Consolas" w:hAnsi="Consolas"/>
+          <w:color w:val="2B4A6B"/>
+          <w:sz w:val="20"/>
+          <w:szCs w:val="20"/>
+        </w:rPr>
+        <w:t xml:space="preserve">CHECK ((statut IN ('ANNULE_PATIENT', 'ANNULE_PRATICIEN')) = (annule_le IS NOT NULL))</w:t>
+      </w:r>
+      <w:r>
+        <w:rPr>
+          <w:sz w:val="22"/>
+          <w:szCs w:val="22"/>
+        </w:rPr>
+        <w:t xml:space="preserve"> sur </w:t>
+      </w:r>
+      <w:r>
+        <w:rPr>
+          <w:rFonts w:ascii="Consolas" w:cs="Consolas" w:eastAsia="Consolas" w:hAnsi="Consolas"/>
+          <w:color w:val="2B4A6B"/>
+          <w:sz w:val="20"/>
+          <w:szCs w:val="20"/>
+        </w:rPr>
+        <w:t xml:space="preserve">rendez_vous</w:t>
+      </w:r>
+      <w:r>
+        <w:rPr>
+          <w:sz w:val="22"/>
+          <w:szCs w:val="22"/>
+        </w:rPr>
+        <w:t xml:space="preserve">.</w:t>
+      </w:r>
+    </w:p>
+    <w:p>
+      <w:pPr>
+        <w:pStyle w:val="ListParagraph"/>
+        <w:numPr>
+          <w:ilvl w:val="0"/>
+          <w:numId w:val="2"/>
+        </w:numPr>
+        <w:spacing w:after="80"/>
+      </w:pPr>
+      <w:r>
+        <w:rPr>
+          <w:sz w:val="22"/>
+          <w:szCs w:val="22"/>
+        </w:rPr>
+        <w:t xml:space="preserve">Période de validité : </w:t>
+      </w:r>
+      <w:r>
+        <w:rPr>
+          <w:rFonts w:ascii="Consolas" w:cs="Consolas" w:eastAsia="Consolas" w:hAnsi="Consolas"/>
+          <w:color w:val="2B4A6B"/>
+          <w:sz w:val="20"/>
+          <w:szCs w:val="20"/>
+        </w:rPr>
+        <w:t xml:space="preserve">CHECK (valide_au IS NULL OR valide_au &gt;= valide_du)</w:t>
+      </w:r>
+      <w:r>
+        <w:rPr>
+          <w:sz w:val="22"/>
+          <w:szCs w:val="22"/>
+        </w:rPr>
+        <w:t xml:space="preserve"> sur </w:t>
+      </w:r>
+      <w:r>
+        <w:rPr>
+          <w:rFonts w:ascii="Consolas" w:cs="Consolas" w:eastAsia="Consolas" w:hAnsi="Consolas"/>
+          <w:color w:val="2B4A6B"/>
+          <w:sz w:val="20"/>
+          <w:szCs w:val="20"/>
+        </w:rPr>
+        <w:t xml:space="preserve">plage_horaire</w:t>
+      </w:r>
+      <w:r>
+        <w:rPr>
+          <w:sz w:val="22"/>
+          <w:szCs w:val="22"/>
+        </w:rPr>
+        <w:t xml:space="preserve">.</w:t>
+      </w:r>
+    </w:p>
+    <w:p>
+      <w:pPr>
+        <w:pStyle w:val="ListParagraph"/>
+        <w:numPr>
+          <w:ilvl w:val="0"/>
+          <w:numId w:val="2"/>
+        </w:numPr>
+        <w:spacing w:after="80"/>
+      </w:pPr>
+      <w:r>
+        <w:rPr>
+          <w:sz w:val="22"/>
+          <w:szCs w:val="22"/>
+        </w:rPr>
+        <w:t xml:space="preserve">Index utiles (PostgreSQL n'indexe pas automatiquement les clés étrangères) : </w:t>
       </w:r>
       <w:r>
         <w:rPr>
@@ -10430,6 +10923,70 @@
           <w:szCs w:val="20"/>
         </w:rPr>
         <w:t xml:space="preserve">plage_horaire (praticien_id, jour_semaine)</w:t>
+      </w:r>
+      <w:r>
+        <w:rPr>
+          <w:sz w:val="22"/>
+          <w:szCs w:val="22"/>
+        </w:rPr>
+        <w:t xml:space="preserve">, </w:t>
+      </w:r>
+      <w:r>
+        <w:rPr>
+          <w:rFonts w:ascii="Consolas" w:cs="Consolas" w:eastAsia="Consolas" w:hAnsi="Consolas"/>
+          <w:color w:val="2B4A6B"/>
+          <w:sz w:val="20"/>
+          <w:szCs w:val="20"/>
+        </w:rPr>
+        <w:t xml:space="preserve">absence (praticien_id, debut)</w:t>
+      </w:r>
+      <w:r>
+        <w:rPr>
+          <w:sz w:val="22"/>
+          <w:szCs w:val="22"/>
+        </w:rPr>
+        <w:t xml:space="preserve">, </w:t>
+      </w:r>
+      <w:r>
+        <w:rPr>
+          <w:rFonts w:ascii="Consolas" w:cs="Consolas" w:eastAsia="Consolas" w:hAnsi="Consolas"/>
+          <w:color w:val="2B4A6B"/>
+          <w:sz w:val="20"/>
+          <w:szCs w:val="20"/>
+        </w:rPr>
+        <w:t xml:space="preserve">motif (praticien_id)</w:t>
+      </w:r>
+      <w:r>
+        <w:rPr>
+          <w:sz w:val="22"/>
+          <w:szCs w:val="22"/>
+        </w:rPr>
+        <w:t xml:space="preserve">, </w:t>
+      </w:r>
+      <w:r>
+        <w:rPr>
+          <w:rFonts w:ascii="Consolas" w:cs="Consolas" w:eastAsia="Consolas" w:hAnsi="Consolas"/>
+          <w:color w:val="2B4A6B"/>
+          <w:sz w:val="20"/>
+          <w:szCs w:val="20"/>
+        </w:rPr>
+        <w:t xml:space="preserve">session (utilisateur_id)</w:t>
+      </w:r>
+      <w:r>
+        <w:rPr>
+          <w:sz w:val="22"/>
+          <w:szCs w:val="22"/>
+        </w:rPr>
+        <w:t xml:space="preserve">, </w:t>
+      </w:r>
+      <w:r>
+        <w:rPr>
+          <w:rFonts w:ascii="Consolas" w:cs="Consolas" w:eastAsia="Consolas" w:hAnsi="Consolas"/>
+          <w:color w:val="2B4A6B"/>
+          <w:sz w:val="20"/>
+          <w:szCs w:val="20"/>
+        </w:rPr>
+        <w:t xml:space="preserve">praticien_specialite (specialite_id)</w:t>
       </w:r>
       <w:r>
         <w:rPr>
@@ -10683,6 +11240,27 @@
           <w:szCs w:val="22"/>
         </w:rPr>
         <w:t xml:space="preserve">Elle préserve l'historique (statistiques, absences répétées d'un patient) et libère quand même le créneau, puisque seule la valeur CONFIRME bloque l'agenda.</w:t>
+      </w:r>
+    </w:p>
+    <w:p>
+      <w:pPr>
+        <w:spacing w:after="120" w:line="276"/>
+      </w:pPr>
+      <w:r>
+        <w:rPr>
+          <w:b/>
+          <w:bCs/>
+          <w:sz w:val="22"/>
+          <w:szCs w:val="22"/>
+        </w:rPr>
+        <w:t xml:space="preserve">Cohérence garantie par des clés étrangères composées. </w:t>
+      </w:r>
+      <w:r>
+        <w:rPr>
+          <w:sz w:val="22"/>
+          <w:szCs w:val="22"/>
+        </w:rPr>
+        <w:t xml:space="preserve">Plutôt qu'un trigger (code procédural caché) ou qu'une vérification dans l'API (contournable par un autre client ou un script SQL), la base garantit de façon déclarative qu'un rendez-vous utilise un motif de son praticien et qu'une ligne patient ou praticien correspond au bon rôle. Le prix : une colonne role redondante dans patient et praticien, et des contraintes UNIQUE redondantes avec les clés primaires, nécessaires comme cibles des clés composées.</w:t>
       </w:r>
     </w:p>
     <w:p>

</xml_diff>